<commit_message>
Add reproducible renv environment and clean project files
</commit_message>
<xml_diff>
--- a/ai_usage_report.docx
+++ b/ai_usage_report.docx
@@ -35,23 +35,7 @@
         <w:t>Instead of asking isolated questions, we consistently provided full contextual blocks. We gave</w:t>
       </w:r>
       <w:r>
-        <w:t xml:space="preserve"> the assistant direct access to the working files such the .</w:t>
-      </w:r>
-      <w:proofErr w:type="spellStart"/>
-      <w:r>
-        <w:t>qmd</w:t>
-      </w:r>
-      <w:proofErr w:type="spellEnd"/>
-      <w:r>
-        <w:t xml:space="preserve"> file, the dataset, and the rendered final design plot image which was exported from </w:t>
-      </w:r>
-      <w:proofErr w:type="spellStart"/>
-      <w:r>
-        <w:t>ggplot</w:t>
-      </w:r>
-      <w:proofErr w:type="spellEnd"/>
-      <w:r>
-        <w:t xml:space="preserve"> and let it read them itself.</w:t>
+        <w:t xml:space="preserve"> the assistant direct access to the working files such the .qmd file, the dataset, and the rendered final design plot image which was exported from ggplot and let it read them itself.</w:t>
       </w:r>
     </w:p>
     <w:p/>
@@ -63,132 +47,103 @@
     <w:p/>
     <w:p>
       <w:r>
-        <w:t xml:space="preserve">Our most effective prompt was a numbered list of design </w:t>
-      </w:r>
-      <w:proofErr w:type="gramStart"/>
-      <w:r>
-        <w:t>questions,</w:t>
-      </w:r>
-      <w:proofErr w:type="gramEnd"/>
-      <w:r>
-        <w:t xml:space="preserve"> each framed as a genuine open choice rather than a leading </w:t>
-      </w:r>
-      <w:proofErr w:type="gramStart"/>
-      <w:r>
-        <w:t>request (</w:t>
+        <w:t>Our most effective prompt was a numbered list of design questions, each framed as a genuine open choice rather than a leading request (</w:t>
       </w:r>
       <w:r>
         <w:rPr>
           <w:i/>
           <w:iCs/>
         </w:rPr>
-        <w:t>"</w:t>
-      </w:r>
-      <w:proofErr w:type="gramEnd"/>
+        <w:t>"1. Is darker color palette better? … 5. For panel D, is this needed? if yes is the contents meaningful and understandable to the readers?"</w:t>
+      </w:r>
+      <w:r>
+        <w:t xml:space="preserve">). </w:t>
+      </w:r>
+    </w:p>
+    <w:p/>
+    <w:p>
+      <w:r>
+        <w:t>Framing them this way produced answers that argued against changes in three of five cases, which is what we wanted — a critic, not an assistant that agrees. Later prompts were defect-driven, often pasting the literal R error (</w:t>
+      </w:r>
       <w:r>
         <w:rPr>
           <w:i/>
           <w:iCs/>
         </w:rPr>
-        <w:t xml:space="preserve">1. Is darker color palette better? … 5. For panel D, is this needed? </w:t>
-      </w:r>
-      <w:proofErr w:type="gramStart"/>
+        <w:t>"Error: '\(' is an unrecognized escape…"</w:t>
+      </w:r>
+      <w:r>
+        <w:t>) or attaching a screenshot of the fault (</w:t>
+      </w:r>
       <w:r>
         <w:rPr>
           <w:i/>
           <w:iCs/>
         </w:rPr>
-        <w:t>if</w:t>
-      </w:r>
-      <w:proofErr w:type="gramEnd"/>
+        <w:t>"[Image 1] clipping in 2025 and 2026"</w:t>
+      </w:r>
+      <w:r>
+        <w:t>). Providing the exact error text or image, rather than describing the symptom, consistently produced a correct fix in one turn.</w:t>
+      </w:r>
+    </w:p>
+    <w:p/>
+    <w:p>
+      <w:pPr>
+        <w:pStyle w:val="Heading2"/>
+      </w:pPr>
+      <w:bookmarkStart w:id="2" w:name="_583fve1nynvs" w:colFirst="0" w:colLast="0"/>
+      <w:bookmarkEnd w:id="2"/>
+      <w:r>
+        <w:t>Influence on Design Decisions</w:t>
+      </w:r>
+    </w:p>
+    <w:p>
+      <w:pPr>
+        <w:rPr>
+          <w:b/>
+          <w:bCs/>
+        </w:rPr>
+      </w:pPr>
+      <w:r>
+        <w:rPr>
+          <w:b/>
+          <w:bCs/>
+        </w:rPr>
+        <w:t>Decision 1:  Panel C changed from absolute USD trillions to percentage share of global GDP</w:t>
+      </w:r>
+    </w:p>
+    <w:p>
+      <w:r>
+        <w:t xml:space="preserve">We had built the regional trend line chart in absolute trillions. Asked whether shares or absolutes were better, the assistant declined to give a universal answer and instead tied the choice to our narrative: </w:t>
+      </w:r>
       <w:r>
         <w:rPr>
           <w:i/>
           <w:iCs/>
         </w:rPr>
-        <w:t xml:space="preserve"> yes is the </w:t>
-      </w:r>
-      <w:proofErr w:type="gramStart"/>
+        <w:t>“absolutes show scale, percentages show structural shift”</w:t>
+      </w:r>
+      <w:r>
+        <w:t xml:space="preserve">, and </w:t>
+      </w:r>
       <w:r>
         <w:rPr>
           <w:i/>
           <w:iCs/>
         </w:rPr>
-        <w:t>contents</w:t>
-      </w:r>
-      <w:proofErr w:type="gramEnd"/>
-      <w:r>
-        <w:rPr>
-          <w:i/>
-          <w:iCs/>
-        </w:rPr>
-        <w:t xml:space="preserve"> meaningful and understandable to the readers?"</w:t>
-      </w:r>
-      <w:r>
-        <w:t xml:space="preserve">). </w:t>
-      </w:r>
-    </w:p>
-    <w:p/>
-    <w:p>
-      <w:r>
-        <w:t xml:space="preserve">Framing them this way produced answers that argued against changes in three of five cases, which is what we </w:t>
-      </w:r>
-      <w:proofErr w:type="gramStart"/>
-      <w:r>
-        <w:t>wanted —</w:t>
-      </w:r>
-      <w:proofErr w:type="gramEnd"/>
-      <w:r>
-        <w:t xml:space="preserve"> a critic, not an assistant that agrees. Later prompts were defect-driven, often pasting the literal R error (</w:t>
-      </w:r>
-      <w:r>
-        <w:rPr>
-          <w:i/>
-          <w:iCs/>
-        </w:rPr>
-        <w:t>"Error: '</w:t>
-      </w:r>
-      <w:proofErr w:type="gramStart"/>
-      <w:r>
-        <w:rPr>
-          <w:i/>
-          <w:iCs/>
-        </w:rPr>
-        <w:t>\(</w:t>
-      </w:r>
-      <w:proofErr w:type="gramEnd"/>
-      <w:r>
-        <w:rPr>
-          <w:i/>
-          <w:iCs/>
-        </w:rPr>
-        <w:t>' is an unrecognized escape…"</w:t>
-      </w:r>
-      <w:r>
-        <w:t>) or attaching a screenshot of the fault (</w:t>
-      </w:r>
-      <w:r>
-        <w:rPr>
-          <w:i/>
-          <w:iCs/>
-        </w:rPr>
-        <w:t>"[Image 1] clipping in 2025 and 2026"</w:t>
-      </w:r>
-      <w:r>
-        <w:t>). Providing the exact error text or image, rather than describing the symptom, consistently produced a correct fix in one turn.</w:t>
-      </w:r>
-    </w:p>
-    <w:p/>
-    <w:p>
-      <w:pPr>
-        <w:pStyle w:val="Heading2"/>
-      </w:pPr>
-      <w:bookmarkStart w:id="2" w:name="_583fve1nynvs" w:colFirst="0" w:colLast="0"/>
-      <w:bookmarkEnd w:id="2"/>
-      <w:r>
-        <w:t>Influence on Design Decisions</w:t>
-      </w:r>
-    </w:p>
+        <w:t>"If your 'Main Story' is about the shift toward Asia, percentages are arguably more effective, as they normalize for the overall growth of the global economy".</w:t>
+      </w:r>
+      <w:r>
+        <w:t xml:space="preserve"> </w:t>
+      </w:r>
+    </w:p>
+    <w:p/>
+    <w:p>
+      <w:r>
+        <w:t>This reframing changed our decision. Our design brief's stated analytical task was the redistribution of economic power, and in absolute terms every region's line rises, so the shift is visually swamped by global growth. We instructed the change and the panel now shows Asia's economic shift over the years. Without the prompt we would have shipped a chart whose visual message contradicted its headline.</w:t>
+      </w:r>
+    </w:p>
+    <w:p/>
     <w:p>
       <w:pPr>
         <w:rPr>
@@ -201,70 +156,14 @@
           <w:b/>
           <w:bCs/>
         </w:rPr>
-        <w:t>Decision 1</w:t>
-      </w:r>
-      <w:proofErr w:type="gramStart"/>
+        <w:t>Decision 2:  Panel C's time window widened from 2016–2026 to 2000–20</w:t>
+      </w:r>
       <w:r>
         <w:rPr>
           <w:b/>
           <w:bCs/>
         </w:rPr>
-        <w:t>:  Panel</w:t>
-      </w:r>
-      <w:proofErr w:type="gramEnd"/>
-      <w:r>
-        <w:rPr>
-          <w:b/>
-          <w:bCs/>
-        </w:rPr>
-        <w:t xml:space="preserve"> C changed from absolute USD trillions to percentage share of global GDP</w:t>
-      </w:r>
-    </w:p>
-    <w:p>
-      <w:r>
-        <w:t xml:space="preserve">We had built the regional trend line chart in absolute trillions. Asked whether shares or absolutes were better, the assistant declined to give a universal answer and instead tied the choice to our narrative: </w:t>
-      </w:r>
-      <w:r>
-        <w:rPr>
-          <w:i/>
-          <w:iCs/>
-        </w:rPr>
-        <w:t>“absolutes show scale, percentages show structural shift”</w:t>
-      </w:r>
-      <w:r>
-        <w:t xml:space="preserve">, and </w:t>
-      </w:r>
-      <w:r>
-        <w:rPr>
-          <w:i/>
-          <w:iCs/>
-        </w:rPr>
-        <w:t>"If your 'Main Story' is about the shift toward Asia, percentages are arguably more effective, as they normalize for the overall growth of the global economy".</w:t>
-      </w:r>
-      <w:r>
-        <w:t xml:space="preserve"> </w:t>
-      </w:r>
-    </w:p>
-    <w:p/>
-    <w:p>
-      <w:r>
-        <w:t>This reframing changed our decision. Our design brief's stated analytical task was the redistribution of economic power, and in absolute terms every region's line rises, so the shift is visually swamped by global growth. We instructed the change and the panel now shows Asia's economic shift over the years. Without the prompt we would have shipped a chart whose visual message contradicted its headline.</w:t>
-      </w:r>
-    </w:p>
-    <w:p/>
-    <w:p>
-      <w:pPr>
-        <w:rPr>
-          <w:b/>
-          <w:bCs/>
-        </w:rPr>
-      </w:pPr>
-      <w:r>
-        <w:rPr>
-          <w:b/>
-          <w:bCs/>
-        </w:rPr>
-        <w:t>Decision 2:  Panel C's time window widened from 2016–2026 to 2000–2026</w:t>
+        <w:t>30</w:t>
       </w:r>
     </w:p>
     <w:p>
@@ -292,24 +191,94 @@
         </w:numPr>
       </w:pPr>
       <w:r>
-        <w:t xml:space="preserve">The 2027–2031 tail is IMF forecast data, which can be misleading if not explicitly distinguished (e.g., via dashed lines or shading). </w:t>
-      </w:r>
-    </w:p>
-    <w:p/>
-    <w:p>
-      <w:r>
-        <w:t>The second point was the decisive one. We had been treating the IMF series as homogeneous and had not registered that including it would present projections as observations. We adopted 2000-2026, changing the filter for in the .</w:t>
-      </w:r>
-      <w:proofErr w:type="spellStart"/>
-      <w:r>
-        <w:t>qmd</w:t>
-      </w:r>
-      <w:proofErr w:type="spellEnd"/>
-      <w:r>
-        <w:t xml:space="preserve"> file. The effect was meaningful: over 26 years the regional lines visibly diverge and cross, whereas the 10-year window showed near-parallel trends. This one recommendation improved both the argument and the honesty of the figure.</w:t>
-      </w:r>
-    </w:p>
-    <w:p/>
+        <w:t>Values after 2026 are IMF projections and must be visually distinguished from</w:t>
+      </w:r>
+      <w:r>
+        <w:t xml:space="preserve"> </w:t>
+      </w:r>
+      <w:r>
+        <w:t>historical observations to avoid presenting</w:t>
+      </w:r>
+      <w:r>
+        <w:t xml:space="preserve"> </w:t>
+      </w:r>
+      <w:r>
+        <w:t>forecasts as actual outcomes.</w:t>
+      </w:r>
+    </w:p>
+    <w:p>
+      <w:pPr>
+        <w:ind w:left="720"/>
+      </w:pPr>
+    </w:p>
+    <w:p>
+      <w:r>
+        <w:t xml:space="preserve">The second point was the decisive one. </w:t>
+      </w:r>
+      <w:r>
+        <w:t>Rather than excluding the</w:t>
+      </w:r>
+      <w:r>
+        <w:t xml:space="preserve"> </w:t>
+      </w:r>
+      <w:r>
+        <w:t>forecast period entirely, we extended the chart to 2030 and encoded the</w:t>
+      </w:r>
+      <w:r>
+        <w:t xml:space="preserve"> </w:t>
+      </w:r>
+      <w:r>
+        <w:t>2026–2030 projections using dotted lines, while keeping the 2000–2026</w:t>
+      </w:r>
+      <w:r>
+        <w:t xml:space="preserve"> </w:t>
+      </w:r>
+      <w:r>
+        <w:t>observations solid. This allows the figure to show the expected</w:t>
+      </w:r>
+      <w:r>
+        <w:t xml:space="preserve"> </w:t>
+      </w:r>
+      <w:r>
+        <w:t>direction of regional GDP shares without treating projected values as</w:t>
+      </w:r>
+      <w:r>
+        <w:t xml:space="preserve"> </w:t>
+      </w:r>
+      <w:r>
+        <w:t>historical data.</w:t>
+      </w:r>
+    </w:p>
+    <w:p/>
+    <w:p>
+      <w:r>
+        <w:t>The longer time window makes the regional divergence and crossover much</w:t>
+      </w:r>
+      <w:r>
+        <w:t xml:space="preserve"> </w:t>
+      </w:r>
+      <w:r>
+        <w:t>clearer than the original 10-year view. At the same time, the change in</w:t>
+      </w:r>
+      <w:r>
+        <w:t xml:space="preserve"> </w:t>
+      </w:r>
+      <w:r>
+        <w:t>line style at 2026 improves the figure’s transparency by clearly</w:t>
+      </w:r>
+      <w:r>
+        <w:t xml:space="preserve"> </w:t>
+      </w:r>
+      <w:r>
+        <w:t>separating observed data from projections. This recommendation</w:t>
+      </w:r>
+      <w:r>
+        <w:t xml:space="preserve"> </w:t>
+      </w:r>
+      <w:r>
+        <w:t>strengthened both the argument and the integrity of the visualization.</w:t>
+      </w:r>
+    </w:p>
     <w:p>
       <w:pPr>
         <w:pStyle w:val="Heading2"/>
@@ -337,39 +306,7 @@
     </w:p>
     <w:p>
       <w:r>
-        <w:t xml:space="preserve">We asked whether a darker palette would be better, the assistant answered in general aesthetic terms, citing The Economist and the FT, and warned mainly about dark-mode contrast. Its actual concern is the light text on dark backgrounds which was irrelevant to us, since our poster is printed on white. Notably, its reasoning never mentioned </w:t>
-      </w:r>
-      <w:proofErr w:type="spellStart"/>
-      <w:r>
-        <w:t>colour</w:t>
-      </w:r>
-      <w:proofErr w:type="spellEnd"/>
-      <w:r>
-        <w:t xml:space="preserve">-vision deficiency or perceptual distinguishability, which are the criteria that matter for a five-category regional palette. We accepted </w:t>
-      </w:r>
-      <w:proofErr w:type="gramStart"/>
-      <w:r>
-        <w:t>the direction</w:t>
-      </w:r>
-      <w:proofErr w:type="gramEnd"/>
-      <w:r>
-        <w:t xml:space="preserve"> but not the </w:t>
-      </w:r>
-      <w:proofErr w:type="gramStart"/>
-      <w:r>
-        <w:t>rationale, and</w:t>
-      </w:r>
-      <w:proofErr w:type="gramEnd"/>
-      <w:r>
-        <w:t xml:space="preserve"> subsequently moved to a </w:t>
-      </w:r>
-      <w:proofErr w:type="spellStart"/>
-      <w:r>
-        <w:t>ColorBrewer</w:t>
-      </w:r>
-      <w:proofErr w:type="spellEnd"/>
-      <w:r>
-        <w:t xml:space="preserve"> palette chosen for print-safety rather than editorial fashion. The lesson is that the assistant's design advice was stylistic where it needed to be perceptual.</w:t>
+        <w:t>We asked whether a darker palette would be better, the assistant answered in general aesthetic terms, citing The Economist and the FT, and warned mainly about dark-mode contrast. Its actual concern is the light text on dark backgrounds which was irrelevant to us, since our poster is printed on white. Notably, its reasoning never mentioned colour-vision deficiency or perceptual distinguishability, which are the criteria that matter for a five-category regional palette. We accepted the direction but not the rationale, and subsequently moved to a ColorBrewer palette chosen for print-safety rather than editorial fashion. The lesson is that the assistant's design advice was stylistic where it needed to be perceptual.</w:t>
       </w:r>
     </w:p>
     <w:p/>
@@ -385,68 +322,117 @@
           <w:b/>
           <w:bCs/>
         </w:rPr>
-        <w:t>Correction 1</w:t>
-      </w:r>
-      <w:proofErr w:type="gramStart"/>
-      <w:r>
+        <w:t>Rejection 2: We rejected the recommendation to end Panel C at 2026</w:t>
+      </w:r>
+    </w:p>
+    <w:p>
+      <w:r>
+        <w:t>The assistant initially recommended using 2000–2026 and excluding the</w:t>
+      </w:r>
+      <w:r>
+        <w:t xml:space="preserve"> </w:t>
+      </w:r>
+      <w:r>
+        <w:t>IMF forecast period</w:t>
+      </w:r>
+      <w:r>
+        <w:t xml:space="preserve"> </w:t>
+      </w:r>
+      <w:r>
+        <w:t>because projections could be mistaken for observed</w:t>
+      </w:r>
+      <w:r>
+        <w:t xml:space="preserve"> </w:t>
+      </w:r>
+      <w:r>
+        <w:t>values. We accepted its concern about transparency but rejected the</w:t>
+      </w:r>
+      <w:r>
+        <w:t xml:space="preserve"> </w:t>
+      </w:r>
+      <w:r>
+        <w:t>recommendation to remove the projections entirely. The forecast period</w:t>
+      </w:r>
+      <w:r>
+        <w:t xml:space="preserve"> </w:t>
+      </w:r>
+      <w:r>
+        <w:t>still provides useful information about the expected direction of</w:t>
+      </w:r>
+      <w:r>
+        <w:t xml:space="preserve"> </w:t>
+      </w:r>
+      <w:r>
+        <w:t>regional GDP shares.</w:t>
+      </w:r>
+      <w:r>
+        <w:t xml:space="preserve"> </w:t>
+      </w:r>
+      <w:r>
+        <w:t>Instead, we extended Panel C to 2030 and introduced a visual</w:t>
+      </w:r>
+      <w:r>
+        <w:t xml:space="preserve"> </w:t>
+      </w:r>
+      <w:r>
+        <w:t>distinction between the two types of data. Values from 2000 to 2026 are</w:t>
+      </w:r>
+      <w:r>
+        <w:t xml:space="preserve"> </w:t>
+      </w:r>
+      <w:r>
+        <w:t>shown with solid lines, while projections from 2026 to 2030 are shown</w:t>
+      </w:r>
+      <w:r>
+        <w:t xml:space="preserve"> </w:t>
+      </w:r>
+      <w:r>
+        <w:t>with dotted lines. This preserves the longer-term outlook without</w:t>
+      </w:r>
+      <w:r>
+        <w:t xml:space="preserve"> </w:t>
+      </w:r>
+      <w:r>
+        <w:t>presenting forecasts as historical observations. The rejection</w:t>
+      </w:r>
+      <w:r>
+        <w:t xml:space="preserve"> </w:t>
+      </w:r>
+      <w:r>
+        <w:t>therefore led to a more informative solution that addressed the</w:t>
+      </w:r>
+      <w:r>
+        <w:t xml:space="preserve"> </w:t>
+      </w:r>
+      <w:r>
+        <w:t>assistant’s underlying concern through visual encoding rather than data</w:t>
+      </w:r>
+      <w:r>
+        <w:t xml:space="preserve"> </w:t>
+      </w:r>
+      <w:r>
+        <w:t>exclusion.</w:t>
+      </w:r>
+    </w:p>
+    <w:p/>
+    <w:p>
+      <w:pPr>
         <w:rPr>
           <w:b/>
           <w:bCs/>
         </w:rPr>
-        <w:t>:  An</w:t>
-      </w:r>
-      <w:proofErr w:type="gramEnd"/>
+      </w:pPr>
       <w:r>
         <w:rPr>
           <w:b/>
           <w:bCs/>
         </w:rPr>
-        <w:t xml:space="preserve"> incomplete fix requiring a second round</w:t>
-      </w:r>
-    </w:p>
-    <w:p>
-      <w:r>
-        <w:t xml:space="preserve">We asked to make Panel C's x-axis end </w:t>
-      </w:r>
-      <w:proofErr w:type="gramStart"/>
-      <w:r>
-        <w:t>at</w:t>
-      </w:r>
-      <w:proofErr w:type="gramEnd"/>
-      <w:r>
-        <w:t xml:space="preserve"> 2026, the assistant set `breaks = </w:t>
-      </w:r>
-      <w:proofErr w:type="gramStart"/>
-      <w:r>
-        <w:t>c(seq(</w:t>
-      </w:r>
-      <w:proofErr w:type="gramEnd"/>
-      <w:r>
-        <w:t xml:space="preserve">2000, 2025, by = 5), </w:t>
-      </w:r>
-      <w:proofErr w:type="gramStart"/>
-      <w:r>
-        <w:t>2026)`</w:t>
-      </w:r>
-      <w:proofErr w:type="gramEnd"/>
-      <w:r>
-        <w:t xml:space="preserve">. This is logically correct but visually wrong: 2025 and 2026 are one year apart and their labels collided. We supplied a screenshot of the </w:t>
-      </w:r>
-      <w:proofErr w:type="gramStart"/>
-      <w:r>
-        <w:t>clipping</w:t>
-      </w:r>
-      <w:proofErr w:type="gramEnd"/>
-      <w:r>
-        <w:t xml:space="preserve"> and it fixed the problem properly with explicit breaks and manual labels. The assistant had reasoned about the data and not about the rendered output — a recurring limitation, since it cannot see the </w:t>
-      </w:r>
-      <w:proofErr w:type="gramStart"/>
-      <w:r>
-        <w:t>figure</w:t>
-      </w:r>
-      <w:proofErr w:type="gramEnd"/>
-      <w:r>
-        <w:t xml:space="preserve"> it produces unless we show it.</w:t>
+        <w:t>Correction 1:  An incomplete fix requiring a second round</w:t>
+      </w:r>
+    </w:p>
+    <w:p>
+      <w:r>
+        <w:t>We asked to make Panel C's x-axis end at 2026, the assistant set `breaks = c(seq(2000, 2025, by = 5), 2026)`. This is logically correct but visually wrong: 2025 and 2026 are one year apart and their labels collided. We supplied a screenshot of the clipping and it fixed the problem properly with explicit breaks and manual labels. The assistant had reasoned about the data and not about the rendered output — a recurring limitation, since it cannot see the figure it produces unless we show it.</w:t>
       </w:r>
     </w:p>
     <w:p/>
@@ -508,36 +494,7 @@
         <w:rPr>
           <w:color w:val="1F1F1F"/>
         </w:rPr>
-        <w:lastRenderedPageBreak/>
-        <w:t>Improper scale sequence specifications (`</w:t>
-      </w:r>
-      <w:proofErr w:type="gramStart"/>
-      <w:r>
-        <w:rPr>
-          <w:color w:val="1F1F1F"/>
-        </w:rPr>
-        <w:t>seq(</w:t>
-      </w:r>
-      <w:proofErr w:type="gramEnd"/>
-      <w:r>
-        <w:rPr>
-          <w:color w:val="1F1F1F"/>
-        </w:rPr>
-        <w:t xml:space="preserve">2000, 2025, by = </w:t>
-      </w:r>
-      <w:proofErr w:type="gramStart"/>
-      <w:r>
-        <w:rPr>
-          <w:color w:val="1F1F1F"/>
-        </w:rPr>
-        <w:t>5)`</w:t>
-      </w:r>
-      <w:proofErr w:type="gramEnd"/>
-      <w:r>
-        <w:rPr>
-          <w:color w:val="1F1F1F"/>
-        </w:rPr>
-        <w:t xml:space="preserve">) leading to 2026 tick clipping. This is </w:t>
+        <w:t xml:space="preserve">Improper scale sequence specifications (`seq(2000, 2025, by = 5)`) leading to 2026 tick clipping. This is </w:t>
       </w:r>
       <w:r>
         <w:t xml:space="preserve">because the assistant cannot see its own rendering as the screenshots were the only reliable channel. </w:t>
@@ -546,34 +503,13 @@
     <w:p/>
     <w:p>
       <w:r>
-        <w:t xml:space="preserve">For the visualization aspect, the recommendations were based on the visual style of well-known publications rather than on readability or accessibility criteria, which is why we replaced its color suggestions with a </w:t>
-      </w:r>
-      <w:proofErr w:type="spellStart"/>
-      <w:r>
-        <w:t>ColorBrewer</w:t>
-      </w:r>
-      <w:proofErr w:type="spellEnd"/>
-      <w:r>
-        <w:t xml:space="preserve"> palette instead.</w:t>
-      </w:r>
-    </w:p>
-    <w:p/>
-    <w:p>
-      <w:proofErr w:type="gramStart"/>
-      <w:r>
-        <w:t>Another</w:t>
-      </w:r>
-      <w:proofErr w:type="gramEnd"/>
-      <w:r>
-        <w:t xml:space="preserve"> to keep in mind is that the AI kept praising our work (calling it "exceptionally well-designed" and "a great example of good design") in the exact same breath that it pointed out major factual errors. We quickly learned to ignore the compliments and focus only on the specific feedback. The AI was </w:t>
-      </w:r>
-      <w:proofErr w:type="gramStart"/>
-      <w:r>
-        <w:t>actually helpful</w:t>
-      </w:r>
-      <w:proofErr w:type="gramEnd"/>
-      <w:r>
-        <w:t xml:space="preserve"> at double-checking our numbers and debating open questions, not at judging whether our work was good.</w:t>
+        <w:t>For the visualization aspect, the recommendations were based on the visual style of well-known publications rather than on readability or accessibility criteria, which is why we replaced its color suggestions with a ColorBrewer palette instead.</w:t>
+      </w:r>
+    </w:p>
+    <w:p/>
+    <w:p>
+      <w:r>
+        <w:t>Another to keep in mind is that the AI kept praising our work (calling it "exceptionally well-designed" and "a great example of good design") in the exact same breath that it pointed out major factual errors. We quickly learned to ignore the compliments and focus only on the specific feedback. The AI was actually helpful at double-checking our numbers and debating open questions, not at judging whether our work was good.</w:t>
       </w:r>
     </w:p>
     <w:p/>
@@ -619,6 +555,12 @@
     </w:p>
     <w:p/>
     <w:sectPr>
+      <w:headerReference w:type="even" r:id="rId7"/>
+      <w:headerReference w:type="default" r:id="rId8"/>
+      <w:footerReference w:type="even" r:id="rId9"/>
+      <w:footerReference w:type="default" r:id="rId10"/>
+      <w:headerReference w:type="first" r:id="rId11"/>
+      <w:footerReference w:type="first" r:id="rId12"/>
       <w:pgSz w:w="11906" w:h="16838"/>
       <w:pgMar w:top="1440" w:right="1440" w:bottom="1440" w:left="1440" w:header="720" w:footer="720" w:gutter="0"/>
       <w:pgNumType w:start="1"/>
@@ -626,6 +568,116 @@
     </w:sectPr>
   </w:body>
 </w:document>
+</file>
+
+<file path=word/endnotes.xml><?xml version="1.0" encoding="utf-8"?>
+<w:endnotes xmlns:wpc="http://schemas.microsoft.com/office/word/2010/wordprocessingCanvas" xmlns:cx="http://schemas.microsoft.com/office/drawing/2014/chartex" xmlns:cx1="http://schemas.microsoft.com/office/drawing/2015/9/8/chartex" xmlns:cx2="http://schemas.microsoft.com/office/drawing/2015/10/21/chartex" xmlns:cx3="http://schemas.microsoft.com/office/drawing/2016/5/9/chartex" xmlns:cx4="http://schemas.microsoft.com/office/drawing/2016/5/10/chartex" xmlns:cx5="http://schemas.microsoft.com/office/drawing/2016/5/11/chartex" xmlns:cx6="http://schemas.microsoft.com/office/drawing/2016/5/12/chartex" xmlns:cx7="http://schemas.microsoft.com/office/drawing/2016/5/13/chartex" xmlns:cx8="http://schemas.microsoft.com/office/drawing/2016/5/14/chartex" xmlns:mc="http://schemas.openxmlformats.org/markup-compatibility/2006" xmlns:aink="http://schemas.microsoft.com/office/drawing/2016/ink" xmlns:am3d="http://schemas.microsoft.com/office/drawing/2017/model3d" xmlns:o="urn:schemas-microsoft-com:office:office" xmlns:oel="http://schemas.microsoft.com/office/2019/extlst" xmlns:r="http://schemas.openxmlformats.org/officeDocument/2006/relationships" xmlns:m="http://schemas.openxmlformats.org/officeDocument/2006/math" xmlns:v="urn:schemas-microsoft-com:vml" xmlns:wp14="http://schemas.microsoft.com/office/word/2010/wordprocessingDrawing" xmlns:wp="http://schemas.openxmlformats.org/drawingml/2006/wordprocessingDrawing" xmlns:w10="urn:schemas-microsoft-com:office:word" xmlns:w="http://schemas.openxmlformats.org/wordprocessingml/2006/main" xmlns:w14="http://schemas.microsoft.com/office/word/2010/wordml" xmlns:w15="http://schemas.microsoft.com/office/word/2012/wordml" xmlns:w16cex="http://schemas.microsoft.com/office/word/2018/wordml/cex" xmlns:w16cid="http://schemas.microsoft.com/office/word/2016/wordml/cid" xmlns:w16="http://schemas.microsoft.com/office/word/2018/wordml" xmlns:w16du="http://schemas.microsoft.com/office/word/2023/wordml/word16du" xmlns:w16sdtdh="http://schemas.microsoft.com/office/word/2020/wordml/sdtdatahash" xmlns:w16sdtfl="http://schemas.microsoft.com/office/word/2024/wordml/sdtformatlock" xmlns:w16se="http://schemas.microsoft.com/office/word/2015/wordml/symex" xmlns:wpg="http://schemas.microsoft.com/office/word/2010/wordprocessingGroup" xmlns:wpi="http://schemas.microsoft.com/office/word/2010/wordprocessingInk" xmlns:wne="http://schemas.microsoft.com/office/word/2006/wordml" xmlns:wps="http://schemas.microsoft.com/office/word/2010/wordprocessingShape" mc:Ignorable="w14 w15 w16se w16cid w16 w16cex w16sdtdh w16sdtfl w16du wp14">
+  <w:endnote w:type="separator" w:id="-1">
+    <w:p>
+      <w:pPr>
+        <w:spacing w:line="240" w:lineRule="auto"/>
+      </w:pPr>
+      <w:r>
+        <w:separator/>
+      </w:r>
+    </w:p>
+  </w:endnote>
+  <w:endnote w:type="continuationSeparator" w:id="0">
+    <w:p>
+      <w:pPr>
+        <w:spacing w:line="240" w:lineRule="auto"/>
+      </w:pPr>
+      <w:r>
+        <w:continuationSeparator/>
+      </w:r>
+    </w:p>
+  </w:endnote>
+</w:endnotes>
+</file>
+
+<file path=word/footer1.xml><?xml version="1.0" encoding="utf-8"?>
+<w:ftr xmlns:wpc="http://schemas.microsoft.com/office/word/2010/wordprocessingCanvas" xmlns:cx="http://schemas.microsoft.com/office/drawing/2014/chartex" xmlns:cx1="http://schemas.microsoft.com/office/drawing/2015/9/8/chartex" xmlns:cx2="http://schemas.microsoft.com/office/drawing/2015/10/21/chartex" xmlns:cx3="http://schemas.microsoft.com/office/drawing/2016/5/9/chartex" xmlns:cx4="http://schemas.microsoft.com/office/drawing/2016/5/10/chartex" xmlns:cx5="http://schemas.microsoft.com/office/drawing/2016/5/11/chartex" xmlns:cx6="http://schemas.microsoft.com/office/drawing/2016/5/12/chartex" xmlns:cx7="http://schemas.microsoft.com/office/drawing/2016/5/13/chartex" xmlns:cx8="http://schemas.microsoft.com/office/drawing/2016/5/14/chartex" xmlns:mc="http://schemas.openxmlformats.org/markup-compatibility/2006" xmlns:aink="http://schemas.microsoft.com/office/drawing/2016/ink" xmlns:am3d="http://schemas.microsoft.com/office/drawing/2017/model3d" xmlns:o="urn:schemas-microsoft-com:office:office" xmlns:oel="http://schemas.microsoft.com/office/2019/extlst" xmlns:r="http://schemas.openxmlformats.org/officeDocument/2006/relationships" xmlns:m="http://schemas.openxmlformats.org/officeDocument/2006/math" xmlns:v="urn:schemas-microsoft-com:vml" xmlns:wp14="http://schemas.microsoft.com/office/word/2010/wordprocessingDrawing" xmlns:wp="http://schemas.openxmlformats.org/drawingml/2006/wordprocessingDrawing" xmlns:w10="urn:schemas-microsoft-com:office:word" xmlns:w="http://schemas.openxmlformats.org/wordprocessingml/2006/main" xmlns:w14="http://schemas.microsoft.com/office/word/2010/wordml" xmlns:w15="http://schemas.microsoft.com/office/word/2012/wordml" xmlns:w16cex="http://schemas.microsoft.com/office/word/2018/wordml/cex" xmlns:w16cid="http://schemas.microsoft.com/office/word/2016/wordml/cid" xmlns:w16="http://schemas.microsoft.com/office/word/2018/wordml" xmlns:w16du="http://schemas.microsoft.com/office/word/2023/wordml/word16du" xmlns:w16sdtdh="http://schemas.microsoft.com/office/word/2020/wordml/sdtdatahash" xmlns:w16sdtfl="http://schemas.microsoft.com/office/word/2024/wordml/sdtformatlock" xmlns:w16se="http://schemas.microsoft.com/office/word/2015/wordml/symex" xmlns:wpg="http://schemas.microsoft.com/office/word/2010/wordprocessingGroup" xmlns:wpi="http://schemas.microsoft.com/office/word/2010/wordprocessingInk" xmlns:wne="http://schemas.microsoft.com/office/word/2006/wordml" xmlns:wps="http://schemas.microsoft.com/office/word/2010/wordprocessingShape" mc:Ignorable="w14 w15 w16se w16cid w16 w16cex w16sdtdh w16sdtfl w16du wp14">
+  <w:p>
+    <w:pPr>
+      <w:pStyle w:val="Footer"/>
+    </w:pPr>
+  </w:p>
+</w:ftr>
+</file>
+
+<file path=word/footer2.xml><?xml version="1.0" encoding="utf-8"?>
+<w:ftr xmlns:wpc="http://schemas.microsoft.com/office/word/2010/wordprocessingCanvas" xmlns:cx="http://schemas.microsoft.com/office/drawing/2014/chartex" xmlns:cx1="http://schemas.microsoft.com/office/drawing/2015/9/8/chartex" xmlns:cx2="http://schemas.microsoft.com/office/drawing/2015/10/21/chartex" xmlns:cx3="http://schemas.microsoft.com/office/drawing/2016/5/9/chartex" xmlns:cx4="http://schemas.microsoft.com/office/drawing/2016/5/10/chartex" xmlns:cx5="http://schemas.microsoft.com/office/drawing/2016/5/11/chartex" xmlns:cx6="http://schemas.microsoft.com/office/drawing/2016/5/12/chartex" xmlns:cx7="http://schemas.microsoft.com/office/drawing/2016/5/13/chartex" xmlns:cx8="http://schemas.microsoft.com/office/drawing/2016/5/14/chartex" xmlns:mc="http://schemas.openxmlformats.org/markup-compatibility/2006" xmlns:aink="http://schemas.microsoft.com/office/drawing/2016/ink" xmlns:am3d="http://schemas.microsoft.com/office/drawing/2017/model3d" xmlns:o="urn:schemas-microsoft-com:office:office" xmlns:oel="http://schemas.microsoft.com/office/2019/extlst" xmlns:r="http://schemas.openxmlformats.org/officeDocument/2006/relationships" xmlns:m="http://schemas.openxmlformats.org/officeDocument/2006/math" xmlns:v="urn:schemas-microsoft-com:vml" xmlns:wp14="http://schemas.microsoft.com/office/word/2010/wordprocessingDrawing" xmlns:wp="http://schemas.openxmlformats.org/drawingml/2006/wordprocessingDrawing" xmlns:w10="urn:schemas-microsoft-com:office:word" xmlns:w="http://schemas.openxmlformats.org/wordprocessingml/2006/main" xmlns:w14="http://schemas.microsoft.com/office/word/2010/wordml" xmlns:w15="http://schemas.microsoft.com/office/word/2012/wordml" xmlns:w16cex="http://schemas.microsoft.com/office/word/2018/wordml/cex" xmlns:w16cid="http://schemas.microsoft.com/office/word/2016/wordml/cid" xmlns:w16="http://schemas.microsoft.com/office/word/2018/wordml" xmlns:w16du="http://schemas.microsoft.com/office/word/2023/wordml/word16du" xmlns:w16sdtdh="http://schemas.microsoft.com/office/word/2020/wordml/sdtdatahash" xmlns:w16sdtfl="http://schemas.microsoft.com/office/word/2024/wordml/sdtformatlock" xmlns:w16se="http://schemas.microsoft.com/office/word/2015/wordml/symex" xmlns:wpg="http://schemas.microsoft.com/office/word/2010/wordprocessingGroup" xmlns:wpi="http://schemas.microsoft.com/office/word/2010/wordprocessingInk" xmlns:wne="http://schemas.microsoft.com/office/word/2006/wordml" xmlns:wps="http://schemas.microsoft.com/office/word/2010/wordprocessingShape" mc:Ignorable="w14 w15 w16se w16cid w16 w16cex w16sdtdh w16sdtfl w16du wp14">
+  <w:p>
+    <w:pPr>
+      <w:pStyle w:val="Footer"/>
+    </w:pPr>
+  </w:p>
+</w:ftr>
+</file>
+
+<file path=word/footer3.xml><?xml version="1.0" encoding="utf-8"?>
+<w:ftr xmlns:wpc="http://schemas.microsoft.com/office/word/2010/wordprocessingCanvas" xmlns:cx="http://schemas.microsoft.com/office/drawing/2014/chartex" xmlns:cx1="http://schemas.microsoft.com/office/drawing/2015/9/8/chartex" xmlns:cx2="http://schemas.microsoft.com/office/drawing/2015/10/21/chartex" xmlns:cx3="http://schemas.microsoft.com/office/drawing/2016/5/9/chartex" xmlns:cx4="http://schemas.microsoft.com/office/drawing/2016/5/10/chartex" xmlns:cx5="http://schemas.microsoft.com/office/drawing/2016/5/11/chartex" xmlns:cx6="http://schemas.microsoft.com/office/drawing/2016/5/12/chartex" xmlns:cx7="http://schemas.microsoft.com/office/drawing/2016/5/13/chartex" xmlns:cx8="http://schemas.microsoft.com/office/drawing/2016/5/14/chartex" xmlns:mc="http://schemas.openxmlformats.org/markup-compatibility/2006" xmlns:aink="http://schemas.microsoft.com/office/drawing/2016/ink" xmlns:am3d="http://schemas.microsoft.com/office/drawing/2017/model3d" xmlns:o="urn:schemas-microsoft-com:office:office" xmlns:oel="http://schemas.microsoft.com/office/2019/extlst" xmlns:r="http://schemas.openxmlformats.org/officeDocument/2006/relationships" xmlns:m="http://schemas.openxmlformats.org/officeDocument/2006/math" xmlns:v="urn:schemas-microsoft-com:vml" xmlns:wp14="http://schemas.microsoft.com/office/word/2010/wordprocessingDrawing" xmlns:wp="http://schemas.openxmlformats.org/drawingml/2006/wordprocessingDrawing" xmlns:w10="urn:schemas-microsoft-com:office:word" xmlns:w="http://schemas.openxmlformats.org/wordprocessingml/2006/main" xmlns:w14="http://schemas.microsoft.com/office/word/2010/wordml" xmlns:w15="http://schemas.microsoft.com/office/word/2012/wordml" xmlns:w16cex="http://schemas.microsoft.com/office/word/2018/wordml/cex" xmlns:w16cid="http://schemas.microsoft.com/office/word/2016/wordml/cid" xmlns:w16="http://schemas.microsoft.com/office/word/2018/wordml" xmlns:w16du="http://schemas.microsoft.com/office/word/2023/wordml/word16du" xmlns:w16sdtdh="http://schemas.microsoft.com/office/word/2020/wordml/sdtdatahash" xmlns:w16sdtfl="http://schemas.microsoft.com/office/word/2024/wordml/sdtformatlock" xmlns:w16se="http://schemas.microsoft.com/office/word/2015/wordml/symex" xmlns:wpg="http://schemas.microsoft.com/office/word/2010/wordprocessingGroup" xmlns:wpi="http://schemas.microsoft.com/office/word/2010/wordprocessingInk" xmlns:wne="http://schemas.microsoft.com/office/word/2006/wordml" xmlns:wps="http://schemas.microsoft.com/office/word/2010/wordprocessingShape" mc:Ignorable="w14 w15 w16se w16cid w16 w16cex w16sdtdh w16sdtfl w16du wp14">
+  <w:p>
+    <w:pPr>
+      <w:pStyle w:val="Footer"/>
+    </w:pPr>
+  </w:p>
+</w:ftr>
+</file>
+
+<file path=word/footnotes.xml><?xml version="1.0" encoding="utf-8"?>
+<w:footnotes xmlns:wpc="http://schemas.microsoft.com/office/word/2010/wordprocessingCanvas" xmlns:cx="http://schemas.microsoft.com/office/drawing/2014/chartex" xmlns:cx1="http://schemas.microsoft.com/office/drawing/2015/9/8/chartex" xmlns:cx2="http://schemas.microsoft.com/office/drawing/2015/10/21/chartex" xmlns:cx3="http://schemas.microsoft.com/office/drawing/2016/5/9/chartex" xmlns:cx4="http://schemas.microsoft.com/office/drawing/2016/5/10/chartex" xmlns:cx5="http://schemas.microsoft.com/office/drawing/2016/5/11/chartex" xmlns:cx6="http://schemas.microsoft.com/office/drawing/2016/5/12/chartex" xmlns:cx7="http://schemas.microsoft.com/office/drawing/2016/5/13/chartex" xmlns:cx8="http://schemas.microsoft.com/office/drawing/2016/5/14/chartex" xmlns:mc="http://schemas.openxmlformats.org/markup-compatibility/2006" xmlns:aink="http://schemas.microsoft.com/office/drawing/2016/ink" xmlns:am3d="http://schemas.microsoft.com/office/drawing/2017/model3d" xmlns:o="urn:schemas-microsoft-com:office:office" xmlns:oel="http://schemas.microsoft.com/office/2019/extlst" xmlns:r="http://schemas.openxmlformats.org/officeDocument/2006/relationships" xmlns:m="http://schemas.openxmlformats.org/officeDocument/2006/math" xmlns:v="urn:schemas-microsoft-com:vml" xmlns:wp14="http://schemas.microsoft.com/office/word/2010/wordprocessingDrawing" xmlns:wp="http://schemas.openxmlformats.org/drawingml/2006/wordprocessingDrawing" xmlns:w10="urn:schemas-microsoft-com:office:word" xmlns:w="http://schemas.openxmlformats.org/wordprocessingml/2006/main" xmlns:w14="http://schemas.microsoft.com/office/word/2010/wordml" xmlns:w15="http://schemas.microsoft.com/office/word/2012/wordml" xmlns:w16cex="http://schemas.microsoft.com/office/word/2018/wordml/cex" xmlns:w16cid="http://schemas.microsoft.com/office/word/2016/wordml/cid" xmlns:w16="http://schemas.microsoft.com/office/word/2018/wordml" xmlns:w16du="http://schemas.microsoft.com/office/word/2023/wordml/word16du" xmlns:w16sdtdh="http://schemas.microsoft.com/office/word/2020/wordml/sdtdatahash" xmlns:w16sdtfl="http://schemas.microsoft.com/office/word/2024/wordml/sdtformatlock" xmlns:w16se="http://schemas.microsoft.com/office/word/2015/wordml/symex" xmlns:wpg="http://schemas.microsoft.com/office/word/2010/wordprocessingGroup" xmlns:wpi="http://schemas.microsoft.com/office/word/2010/wordprocessingInk" xmlns:wne="http://schemas.microsoft.com/office/word/2006/wordml" xmlns:wps="http://schemas.microsoft.com/office/word/2010/wordprocessingShape" mc:Ignorable="w14 w15 w16se w16cid w16 w16cex w16sdtdh w16sdtfl w16du wp14">
+  <w:footnote w:type="separator" w:id="-1">
+    <w:p>
+      <w:pPr>
+        <w:spacing w:line="240" w:lineRule="auto"/>
+      </w:pPr>
+      <w:r>
+        <w:separator/>
+      </w:r>
+    </w:p>
+  </w:footnote>
+  <w:footnote w:type="continuationSeparator" w:id="0">
+    <w:p>
+      <w:pPr>
+        <w:spacing w:line="240" w:lineRule="auto"/>
+      </w:pPr>
+      <w:r>
+        <w:continuationSeparator/>
+      </w:r>
+    </w:p>
+  </w:footnote>
+</w:footnotes>
+</file>
+
+<file path=word/header1.xml><?xml version="1.0" encoding="utf-8"?>
+<w:hdr xmlns:wpc="http://schemas.microsoft.com/office/word/2010/wordprocessingCanvas" xmlns:cx="http://schemas.microsoft.com/office/drawing/2014/chartex" xmlns:cx1="http://schemas.microsoft.com/office/drawing/2015/9/8/chartex" xmlns:cx2="http://schemas.microsoft.com/office/drawing/2015/10/21/chartex" xmlns:cx3="http://schemas.microsoft.com/office/drawing/2016/5/9/chartex" xmlns:cx4="http://schemas.microsoft.com/office/drawing/2016/5/10/chartex" xmlns:cx5="http://schemas.microsoft.com/office/drawing/2016/5/11/chartex" xmlns:cx6="http://schemas.microsoft.com/office/drawing/2016/5/12/chartex" xmlns:cx7="http://schemas.microsoft.com/office/drawing/2016/5/13/chartex" xmlns:cx8="http://schemas.microsoft.com/office/drawing/2016/5/14/chartex" xmlns:mc="http://schemas.openxmlformats.org/markup-compatibility/2006" xmlns:aink="http://schemas.microsoft.com/office/drawing/2016/ink" xmlns:am3d="http://schemas.microsoft.com/office/drawing/2017/model3d" xmlns:o="urn:schemas-microsoft-com:office:office" xmlns:oel="http://schemas.microsoft.com/office/2019/extlst" xmlns:r="http://schemas.openxmlformats.org/officeDocument/2006/relationships" xmlns:m="http://schemas.openxmlformats.org/officeDocument/2006/math" xmlns:v="urn:schemas-microsoft-com:vml" xmlns:wp14="http://schemas.microsoft.com/office/word/2010/wordprocessingDrawing" xmlns:wp="http://schemas.openxmlformats.org/drawingml/2006/wordprocessingDrawing" xmlns:w10="urn:schemas-microsoft-com:office:word" xmlns:w="http://schemas.openxmlformats.org/wordprocessingml/2006/main" xmlns:w14="http://schemas.microsoft.com/office/word/2010/wordml" xmlns:w15="http://schemas.microsoft.com/office/word/2012/wordml" xmlns:w16cex="http://schemas.microsoft.com/office/word/2018/wordml/cex" xmlns:w16cid="http://schemas.microsoft.com/office/word/2016/wordml/cid" xmlns:w16="http://schemas.microsoft.com/office/word/2018/wordml" xmlns:w16du="http://schemas.microsoft.com/office/word/2023/wordml/word16du" xmlns:w16sdtdh="http://schemas.microsoft.com/office/word/2020/wordml/sdtdatahash" xmlns:w16sdtfl="http://schemas.microsoft.com/office/word/2024/wordml/sdtformatlock" xmlns:w16se="http://schemas.microsoft.com/office/word/2015/wordml/symex" xmlns:wpg="http://schemas.microsoft.com/office/word/2010/wordprocessingGroup" xmlns:wpi="http://schemas.microsoft.com/office/word/2010/wordprocessingInk" xmlns:wne="http://schemas.microsoft.com/office/word/2006/wordml" xmlns:wps="http://schemas.microsoft.com/office/word/2010/wordprocessingShape" mc:Ignorable="w14 w15 w16se w16cid w16 w16cex w16sdtdh w16sdtfl w16du wp14">
+  <w:p>
+    <w:pPr>
+      <w:pStyle w:val="Header"/>
+    </w:pPr>
+  </w:p>
+</w:hdr>
+</file>
+
+<file path=word/header2.xml><?xml version="1.0" encoding="utf-8"?>
+<w:hdr xmlns:wpc="http://schemas.microsoft.com/office/word/2010/wordprocessingCanvas" xmlns:cx="http://schemas.microsoft.com/office/drawing/2014/chartex" xmlns:cx1="http://schemas.microsoft.com/office/drawing/2015/9/8/chartex" xmlns:cx2="http://schemas.microsoft.com/office/drawing/2015/10/21/chartex" xmlns:cx3="http://schemas.microsoft.com/office/drawing/2016/5/9/chartex" xmlns:cx4="http://schemas.microsoft.com/office/drawing/2016/5/10/chartex" xmlns:cx5="http://schemas.microsoft.com/office/drawing/2016/5/11/chartex" xmlns:cx6="http://schemas.microsoft.com/office/drawing/2016/5/12/chartex" xmlns:cx7="http://schemas.microsoft.com/office/drawing/2016/5/13/chartex" xmlns:cx8="http://schemas.microsoft.com/office/drawing/2016/5/14/chartex" xmlns:mc="http://schemas.openxmlformats.org/markup-compatibility/2006" xmlns:aink="http://schemas.microsoft.com/office/drawing/2016/ink" xmlns:am3d="http://schemas.microsoft.com/office/drawing/2017/model3d" xmlns:o="urn:schemas-microsoft-com:office:office" xmlns:oel="http://schemas.microsoft.com/office/2019/extlst" xmlns:r="http://schemas.openxmlformats.org/officeDocument/2006/relationships" xmlns:m="http://schemas.openxmlformats.org/officeDocument/2006/math" xmlns:v="urn:schemas-microsoft-com:vml" xmlns:wp14="http://schemas.microsoft.com/office/word/2010/wordprocessingDrawing" xmlns:wp="http://schemas.openxmlformats.org/drawingml/2006/wordprocessingDrawing" xmlns:w10="urn:schemas-microsoft-com:office:word" xmlns:w="http://schemas.openxmlformats.org/wordprocessingml/2006/main" xmlns:w14="http://schemas.microsoft.com/office/word/2010/wordml" xmlns:w15="http://schemas.microsoft.com/office/word/2012/wordml" xmlns:w16cex="http://schemas.microsoft.com/office/word/2018/wordml/cex" xmlns:w16cid="http://schemas.microsoft.com/office/word/2016/wordml/cid" xmlns:w16="http://schemas.microsoft.com/office/word/2018/wordml" xmlns:w16du="http://schemas.microsoft.com/office/word/2023/wordml/word16du" xmlns:w16sdtdh="http://schemas.microsoft.com/office/word/2020/wordml/sdtdatahash" xmlns:w16sdtfl="http://schemas.microsoft.com/office/word/2024/wordml/sdtformatlock" xmlns:w16se="http://schemas.microsoft.com/office/word/2015/wordml/symex" xmlns:wpg="http://schemas.microsoft.com/office/word/2010/wordprocessingGroup" xmlns:wpi="http://schemas.microsoft.com/office/word/2010/wordprocessingInk" xmlns:wne="http://schemas.microsoft.com/office/word/2006/wordml" xmlns:wps="http://schemas.microsoft.com/office/word/2010/wordprocessingShape" mc:Ignorable="w14 w15 w16se w16cid w16 w16cex w16sdtdh w16sdtfl w16du wp14">
+  <w:p>
+    <w:pPr>
+      <w:pStyle w:val="Header"/>
+    </w:pPr>
+  </w:p>
+</w:hdr>
+</file>
+
+<file path=word/header3.xml><?xml version="1.0" encoding="utf-8"?>
+<w:hdr xmlns:wpc="http://schemas.microsoft.com/office/word/2010/wordprocessingCanvas" xmlns:cx="http://schemas.microsoft.com/office/drawing/2014/chartex" xmlns:cx1="http://schemas.microsoft.com/office/drawing/2015/9/8/chartex" xmlns:cx2="http://schemas.microsoft.com/office/drawing/2015/10/21/chartex" xmlns:cx3="http://schemas.microsoft.com/office/drawing/2016/5/9/chartex" xmlns:cx4="http://schemas.microsoft.com/office/drawing/2016/5/10/chartex" xmlns:cx5="http://schemas.microsoft.com/office/drawing/2016/5/11/chartex" xmlns:cx6="http://schemas.microsoft.com/office/drawing/2016/5/12/chartex" xmlns:cx7="http://schemas.microsoft.com/office/drawing/2016/5/13/chartex" xmlns:cx8="http://schemas.microsoft.com/office/drawing/2016/5/14/chartex" xmlns:mc="http://schemas.openxmlformats.org/markup-compatibility/2006" xmlns:aink="http://schemas.microsoft.com/office/drawing/2016/ink" xmlns:am3d="http://schemas.microsoft.com/office/drawing/2017/model3d" xmlns:o="urn:schemas-microsoft-com:office:office" xmlns:oel="http://schemas.microsoft.com/office/2019/extlst" xmlns:r="http://schemas.openxmlformats.org/officeDocument/2006/relationships" xmlns:m="http://schemas.openxmlformats.org/officeDocument/2006/math" xmlns:v="urn:schemas-microsoft-com:vml" xmlns:wp14="http://schemas.microsoft.com/office/word/2010/wordprocessingDrawing" xmlns:wp="http://schemas.openxmlformats.org/drawingml/2006/wordprocessingDrawing" xmlns:w10="urn:schemas-microsoft-com:office:word" xmlns:w="http://schemas.openxmlformats.org/wordprocessingml/2006/main" xmlns:w14="http://schemas.microsoft.com/office/word/2010/wordml" xmlns:w15="http://schemas.microsoft.com/office/word/2012/wordml" xmlns:w16cex="http://schemas.microsoft.com/office/word/2018/wordml/cex" xmlns:w16cid="http://schemas.microsoft.com/office/word/2016/wordml/cid" xmlns:w16="http://schemas.microsoft.com/office/word/2018/wordml" xmlns:w16du="http://schemas.microsoft.com/office/word/2023/wordml/word16du" xmlns:w16sdtdh="http://schemas.microsoft.com/office/word/2020/wordml/sdtdatahash" xmlns:w16sdtfl="http://schemas.microsoft.com/office/word/2024/wordml/sdtformatlock" xmlns:w16se="http://schemas.microsoft.com/office/word/2015/wordml/symex" xmlns:wpg="http://schemas.microsoft.com/office/word/2010/wordprocessingGroup" xmlns:wpi="http://schemas.microsoft.com/office/word/2010/wordprocessingInk" xmlns:wne="http://schemas.microsoft.com/office/word/2006/wordml" xmlns:wps="http://schemas.microsoft.com/office/word/2010/wordprocessingShape" mc:Ignorable="w14 w15 w16se w16cid w16 w16cex w16sdtdh w16sdtfl w16du wp14">
+  <w:p>
+    <w:pPr>
+      <w:pStyle w:val="Header"/>
+    </w:pPr>
+  </w:p>
+</w:hdr>
 </file>
 
 <file path=word/numbering.xml><?xml version="1.0" encoding="utf-8"?>
@@ -1332,6 +1384,50 @@
       <w:szCs w:val="30"/>
     </w:rPr>
   </w:style>
+  <w:style w:type="paragraph" w:styleId="Header">
+    <w:name w:val="header"/>
+    <w:basedOn w:val="Normal"/>
+    <w:link w:val="HeaderChar"/>
+    <w:uiPriority w:val="99"/>
+    <w:unhideWhenUsed/>
+    <w:rsid w:val="006E46AB"/>
+    <w:pPr>
+      <w:tabs>
+        <w:tab w:val="center" w:pos="4513"/>
+        <w:tab w:val="right" w:pos="9026"/>
+      </w:tabs>
+      <w:spacing w:line="240" w:lineRule="auto"/>
+    </w:pPr>
+  </w:style>
+  <w:style w:type="character" w:customStyle="1" w:styleId="HeaderChar">
+    <w:name w:val="Header Char"/>
+    <w:basedOn w:val="DefaultParagraphFont"/>
+    <w:link w:val="Header"/>
+    <w:uiPriority w:val="99"/>
+    <w:rsid w:val="006E46AB"/>
+  </w:style>
+  <w:style w:type="paragraph" w:styleId="Footer">
+    <w:name w:val="footer"/>
+    <w:basedOn w:val="Normal"/>
+    <w:link w:val="FooterChar"/>
+    <w:uiPriority w:val="99"/>
+    <w:unhideWhenUsed/>
+    <w:rsid w:val="006E46AB"/>
+    <w:pPr>
+      <w:tabs>
+        <w:tab w:val="center" w:pos="4513"/>
+        <w:tab w:val="right" w:pos="9026"/>
+      </w:tabs>
+      <w:spacing w:line="240" w:lineRule="auto"/>
+    </w:pPr>
+  </w:style>
+  <w:style w:type="character" w:customStyle="1" w:styleId="FooterChar">
+    <w:name w:val="Footer Char"/>
+    <w:basedOn w:val="DefaultParagraphFont"/>
+    <w:link w:val="Footer"/>
+    <w:uiPriority w:val="99"/>
+    <w:rsid w:val="006E46AB"/>
+  </w:style>
 </w:styles>
 </file>
 

</xml_diff>

<commit_message>
Fix colorblind-safe palette, add key insight, remove em-dashes, re-render
- Swap ColorBrewer Set1 for genuine Okabe & Ito (2008) colorblind-safe hex values
- Add verified key insight callout (Asia overtaking Americas in GDP share)
- Remove em-dashes from README, qmd, and AI usage report
- Add .graphifyignore to exclude renv internals from graph scans
- Re-render gdp_redesign.qmd (HTML, PNG, figure panels reflect new palette/text)
</commit_message>
<xml_diff>
--- a/ai_usage_report.docx
+++ b/ai_usage_report.docx
@@ -63,7 +63,7 @@
     <w:p/>
     <w:p>
       <w:r>
-        <w:t>Framing them this way produced answers that argued against changes in three of five cases, which is what we wanted — a critic, not an assistant that agrees. Later prompts were defect-driven, often pasting the literal R error (</w:t>
+        <w:t>Framing them this way produced answers that argued against changes in three of five cases, which is what we wanted: a critic, not an assistant that agrees. Later prompts were defect-driven, often pasting the literal R error (</w:t>
       </w:r>
       <w:r>
         <w:rPr>
@@ -432,7 +432,7 @@
     </w:p>
     <w:p>
       <w:r>
-        <w:t>We asked to make Panel C's x-axis end at 2026, the assistant set `breaks = c(seq(2000, 2025, by = 5), 2026)`. This is logically correct but visually wrong: 2025 and 2026 are one year apart and their labels collided. We supplied a screenshot of the clipping and it fixed the problem properly with explicit breaks and manual labels. The assistant had reasoned about the data and not about the rendered output — a recurring limitation, since it cannot see the figure it produces unless we show it.</w:t>
+        <w:t>We asked to make Panel C's x-axis end at 2026, the assistant set `breaks = c(seq(2000, 2025, by = 5), 2026)`. This is logically correct but visually wrong: 2025 and 2026 are one year apart and their labels collided. We supplied a screenshot of the clipping and it fixed the problem properly with explicit breaks and manual labels. The assistant had reasoned about the data and not about the rendered output, a recurring limitation, since it cannot see the figure it produces unless we show it.</w:t>
       </w:r>
     </w:p>
     <w:p/>

</xml_diff>

<commit_message>
ai report and plot update
- data label for panel c
- rectify ai report and logs
</commit_message>
<xml_diff>
--- a/ai_usage_report.docx
+++ b/ai_usage_report.docx
@@ -167,9 +167,17 @@
       </w:r>
     </w:p>
     <w:p>
+      <w:pPr>
+        <w:spacing w:line="276" w:lineRule="auto"/>
+      </w:pPr>
       <w:r>
         <w:lastRenderedPageBreak/>
-        <w:t xml:space="preserve">We asked whether to show 2016-2026, 1980-2031, 2000-2026, or 2000-2031. The assistant recommended 2000-2026 with two arguments: </w:t>
+        <w:rPr>
+          <w:rFonts w:ascii="Arial" w:hAnsi="Arial" w:eastAsia="Arial" w:cs="Arial"/>
+          <w:sz w:val="22"/>
+          <w:szCs w:val="22"/>
+        </w:rPr>
+        <w:t xml:space="preserve">We asked whether to show 2016-2026, 1980-2030, 2000-2026, or 2000-2030. The assistant recommended 2000-2026 with two arguments: </w:t>
       </w:r>
     </w:p>
     <w:p>
@@ -305,8 +313,16 @@
       </w:r>
     </w:p>
     <w:p>
-      <w:r>
-        <w:t>We asked whether a darker palette would be better, the assistant answered in general aesthetic terms, citing The Economist and the FT, and warned mainly about dark-mode contrast. Its actual concern is the light text on dark backgrounds which was irrelevant to us, since our poster is printed on white. Notably, its reasoning never mentioned colour-vision deficiency or perceptual distinguishability, which are the criteria that matter for a five-category regional palette. We accepted the direction but not the rationale, and subsequently moved to a ColorBrewer palette chosen for print-safety rather than editorial fashion. The lesson is that the assistant's design advice was stylistic where it needed to be perceptual.</w:t>
+      <w:pPr>
+        <w:spacing w:line="276" w:lineRule="auto"/>
+      </w:pPr>
+      <w:r>
+        <w:rPr>
+          <w:rFonts w:ascii="Arial" w:hAnsi="Arial" w:eastAsia="Arial" w:cs="Arial"/>
+          <w:sz w:val="22"/>
+          <w:szCs w:val="22"/>
+        </w:rPr>
+        <w:t>We asked whether a darker palette would be better, the assistant answered in general aesthetic terms, citing The Economist and the FT, and warned mainly about dark-mode contrast. Its actual concern is the light text on dark backgrounds which was irrelevant to us, since our poster is printed on white. Notably, its reasoning never mentioned colour-vision deficiency or perceptual distinguishability, which are the criteria that matter for a five-category regional palette. We accepted the direction but not the rationale, and subsequently our team members decided to research online and choose the Okabe-Ito palette which is color-blind friendly. The lesson is that the assistant's design advice was stylistic where it needed to be perceptual.</w:t>
       </w:r>
     </w:p>
     <w:p/>
@@ -326,92 +342,16 @@
       </w:r>
     </w:p>
     <w:p>
-      <w:r>
-        <w:t>The assistant initially recommended using 2000–2026 and excluding the</w:t>
-      </w:r>
-      <w:r>
-        <w:t xml:space="preserve"> </w:t>
-      </w:r>
-      <w:r>
-        <w:t>IMF forecast period</w:t>
-      </w:r>
-      <w:r>
-        <w:t xml:space="preserve"> </w:t>
-      </w:r>
-      <w:r>
-        <w:t>because projections could be mistaken for observed</w:t>
-      </w:r>
-      <w:r>
-        <w:t xml:space="preserve"> </w:t>
-      </w:r>
-      <w:r>
-        <w:t>values. We accepted its concern about transparency but rejected the</w:t>
-      </w:r>
-      <w:r>
-        <w:t xml:space="preserve"> </w:t>
-      </w:r>
-      <w:r>
-        <w:t>recommendation to remove the projections entirely. The forecast period</w:t>
-      </w:r>
-      <w:r>
-        <w:t xml:space="preserve"> </w:t>
-      </w:r>
-      <w:r>
-        <w:t>still provides useful information about the expected direction of</w:t>
-      </w:r>
-      <w:r>
-        <w:t xml:space="preserve"> </w:t>
-      </w:r>
-      <w:r>
-        <w:t>regional GDP shares.</w:t>
-      </w:r>
-      <w:r>
-        <w:t xml:space="preserve"> </w:t>
-      </w:r>
-      <w:r>
-        <w:t>Instead, we extended Panel C to 2030 and introduced a visual</w:t>
-      </w:r>
-      <w:r>
-        <w:t xml:space="preserve"> </w:t>
-      </w:r>
-      <w:r>
-        <w:t>distinction between the two types of data. Values from 2000 to 2026 are</w:t>
-      </w:r>
-      <w:r>
-        <w:t xml:space="preserve"> </w:t>
-      </w:r>
-      <w:r>
-        <w:t>shown with solid lines, while projections from 2026 to 2030 are shown</w:t>
-      </w:r>
-      <w:r>
-        <w:t xml:space="preserve"> </w:t>
-      </w:r>
-      <w:r>
-        <w:t>with dotted lines. This preserves the longer-term outlook without</w:t>
-      </w:r>
-      <w:r>
-        <w:t xml:space="preserve"> </w:t>
-      </w:r>
-      <w:r>
-        <w:t>presenting forecasts as historical observations. The rejection</w:t>
-      </w:r>
-      <w:r>
-        <w:t xml:space="preserve"> </w:t>
-      </w:r>
-      <w:r>
-        <w:t>therefore led to a more informative solution that addressed the</w:t>
-      </w:r>
-      <w:r>
-        <w:t xml:space="preserve"> </w:t>
-      </w:r>
-      <w:r>
-        <w:t>assistant’s underlying concern through visual encoding rather than data</w:t>
-      </w:r>
-      <w:r>
-        <w:t xml:space="preserve"> </w:t>
-      </w:r>
-      <w:r>
-        <w:t>exclusion.</w:t>
+      <w:pPr>
+        <w:spacing w:line="276" w:lineRule="auto"/>
+      </w:pPr>
+      <w:r>
+        <w:rPr>
+          <w:rFonts w:ascii="Arial" w:hAnsi="Arial" w:eastAsia="Arial" w:cs="Arial"/>
+          <w:sz w:val="22"/>
+          <w:szCs w:val="22"/>
+        </w:rPr>
+        <w:t>The assistant initially recommended using 2000–2026 and excluding the IMF forecast period because projections could be mistaken for observed values. We accepted its concern about transparency but rejected the recommendation to remove the projections entirely. The forecast period still provides useful information about the expected direction of regional GDP shares. Instead, we extended Panel C to 2030 and introduced a visual distinction between the two types of data. Values from 2000 to 2026 are shown with solid lines, while projections from 2026 to 2030 are shown with dotted lines. This preserves the longer-term outlook without presenting forecasts as historical observations. The rejection therefore led to a more informative solution that addressed the assistant’s underlying concern through visual encoding rather than data exclusion.co</w:t>
       </w:r>
     </w:p>
     <w:p/>
@@ -502,8 +442,16 @@
     </w:p>
     <w:p/>
     <w:p>
-      <w:r>
-        <w:t>For the visualization aspect, the recommendations were based on the visual style of well-known publications rather than on readability or accessibility criteria, which is why we replaced its color suggestions with a ColorBrewer palette instead.</w:t>
+      <w:pPr>
+        <w:spacing w:line="276" w:lineRule="auto"/>
+      </w:pPr>
+      <w:r>
+        <w:rPr>
+          <w:rFonts w:ascii="Arial" w:hAnsi="Arial" w:eastAsia="Arial" w:cs="Arial"/>
+          <w:sz w:val="22"/>
+          <w:szCs w:val="22"/>
+        </w:rPr>
+        <w:t>For the visualization aspect, the recommendations were based on the visual style of well-known publications rather than on readability or accessibility criteria, which is why we replaced its color suggestions to the one my group member researched online which is Okabe-Ito, a color-blind friendly palette.</w:t>
       </w:r>
     </w:p>
     <w:p/>
@@ -555,7 +503,7 @@
           <w:sz w:val="22"/>
           <w:szCs w:val="22"/>
         </w:rPr>
-        <w:t>Word count: 1164</w:t>
+        <w:t>Word count: 1184</w:t>
       </w:r>
     </w:p>
     <w:p/>

</xml_diff>